<commit_message>
Servidor 19.02.26 | Staff  e arquivos de uploads
</commit_message>
<xml_diff>
--- a/uploads/Proposta/PropostaCBM 2026_CBM_.docx
+++ b/uploads/Proposta/PropostaCBM 2026_CBM_.docx
@@ -638,7 +638,7 @@
             <w:br/>
             <w:t xml:space="preserve"/>
             <w:br/>
-            <w:t xml:space="preserve">• 1 Analista De Projetos, (PROJETO), 30 Diária(s), de: 15/02/2026 até: 16/03/2026</w:t>
+            <w:t xml:space="preserve">• 1 Analista De Projetos, (PROJETO), 15 Diária(s), de: 02/03/2026 até: 16/03/2026</w:t>
           </w:r>
         </w:t>
       </w:r>
@@ -1008,7 +1008,7 @@
           <w:sz w:val="24"/>
           <w:szCs w:val="24"/>
         </w:rPr>
-        <w:t xml:space="preserve">• 1 Coordenador De Atendimento - EscritóRio Ja, (ATENDIMENTO), 50 Diária(s), de: 26/01/2026 até: 16/03/2026</w:t>
+        <w:t xml:space="preserve">• 1 Coordenador De Atendimento - EscritóRio Ja, (ATENDIMENTO), 20 Diária(s), de: 25/02/2026 até: 16/03/2026</w:t>
       </w:r>
     </w:p>
     <w:p>
@@ -1048,7 +1048,7 @@
           <w:sz w:val="24"/>
           <w:szCs w:val="24"/>
         </w:rPr>
-        <w:t xml:space="preserve">• 4 Ajudante De MarcaçãO, (OPERACIONAL), 1 Diária(s), de: 16/03/2026 até: 16/03/2026</w:t>
+        <w:t xml:space="preserve">• 2 Ajudante De MarcaçãO, (OPERACIONAL), 1 Diária(s), de: 16/03/2026 até: 16/03/2026</w:t>
       </w:r>
     </w:p>
     <w:p>
@@ -1088,7 +1088,7 @@
           <w:sz w:val="24"/>
           <w:szCs w:val="24"/>
         </w:rPr>
-        <w:t xml:space="preserve">• 2 Fiscal Diurno, (OPERACIONAL), 8 Diária(s), de: 16/03/2026 até: 23/03/2026</w:t>
+        <w:t xml:space="preserve">• 1 Fiscal Diurno, (OPERACIONAL), 8 Diária(s), de: 16/03/2026 até: 23/03/2026</w:t>
       </w:r>
     </w:p>
     <w:p>
@@ -1108,7 +1108,7 @@
           <w:sz w:val="24"/>
           <w:szCs w:val="24"/>
         </w:rPr>
-        <w:t xml:space="preserve">• 2 Fiscal Noturno, (OPERACIONAL), 8 Diária(s), de: 16/03/2026 até: 23/03/2026</w:t>
+        <w:t xml:space="preserve">• 1 Fiscal Noturno, (OPERACIONAL), 8 Diária(s), de: 16/03/2026 até: 23/03/2026</w:t>
       </w:r>
     </w:p>
     <w:p>
@@ -1128,7 +1128,7 @@
           <w:sz w:val="24"/>
           <w:szCs w:val="24"/>
         </w:rPr>
-        <w:t xml:space="preserve">• 1 Sistema AnáLise De Projetos, (PROJETO), 1 Diária(s), de: 16/03/2026 até: 16/03/2026</w:t>
+        <w:t xml:space="preserve">• 1 Coordenador De Caex, 6 Diária(s), de: 17/03/2026 até: 22/03/2026</w:t>
       </w:r>
     </w:p>
     <w:p>
@@ -1649,7 +1649,7 @@
           <w:sz w:val="24"/>
           <w:szCs w:val="24"/>
         </w:rPr>
-        <w:t xml:space="preserve">R$ 83.477,50</w:t>
+        <w:t xml:space="preserve">R$ 60.000,00</w:t>
       </w:r>
       <w:r>
         <w:rPr>
@@ -1828,7 +1828,7 @@
           <w:i/>
           <w:iCs/>
         </w:rPr>
-        <w:t xml:space="preserve">16/01/2026</w:t>
+        <w:t xml:space="preserve">18/02/2026</w:t>
       </w:r>
     </w:p>
     <w:p>

</xml_diff>